<commit_message>
modelle: eigene whisper.cpp-Modelle aus <Bibliothek>/Modelle — still ablegen, geprüft (ggml-Magic, fertig kopiert), eigen ersetzt mitgeliefert; Einstellungen zeigen Ordner, Neu einlesen, Gründe; Doku + Blätter ×4
Co-Authored-By: Claude Fable 5.1 <noreply@anthropic.com>
Claude-Session: https://claude.ai/code/session_01VhoDoDyamQwRzZ3dqypMTk
</commit_message>
<xml_diff>
--- a/site/docs/localtranscript-app-blatt-de.docx
+++ b/site/docs/localtranscript-app-blatt-de.docx
@@ -314,7 +314,25 @@
         <w:t xml:space="preserve"> </w:t>
       </w:r>
       <w:r>
-        <w:t xml:space="preserve">einem KI-Dienst, kein Konto, keinen Schlüssel.</w:t>
+        <w:t xml:space="preserve">einem KI-Dienst, kein Konto, keinen Schlüssel. Wer ein anderes</w:t>
+      </w:r>
+      <w:r>
+        <w:t xml:space="preserve"> </w:t>
+      </w:r>
+      <w:r>
+        <w:t xml:space="preserve">whisper.cpp-Modell einsetzen will, legt es selbst in den Ordner</w:t>
+      </w:r>
+      <w:r>
+        <w:t xml:space="preserve"> </w:t>
+      </w:r>
+      <w:r>
+        <w:t xml:space="preserve">«Modelle» der Bibliothek; ein solches Modell ist nicht Teil dieser</w:t>
+      </w:r>
+      <w:r>
+        <w:t xml:space="preserve"> </w:t>
+      </w:r>
+      <w:r>
+        <w:t xml:space="preserve">Liste, und im Journal jedes Transkripts steht, womit es entstand.</w:t>
       </w:r>
     </w:p>
     <w:p>

</xml_diff>

<commit_message>
release 2.3.0 vorbereiten: Version überall 2.3.0, Blätter Stand 11. September; textsatz neu vendoren (enrich@f871d33); producer-Umgehung raus und by-Prüfung scharf — enrich edc497e ergänzt producer nur noch und respektiert mitgebrachtes by
Co-Authored-By: Claude Fable 5.1 <noreply@anthropic.com>
Claude-Session: https://claude.ai/code/session_01VhoDoDyamQwRzZ3dqypMTk
</commit_message>
<xml_diff>
--- a/site/docs/localtranscript-app-blatt-de.docx
+++ b/site/docs/localtranscript-app-blatt-de.docx
@@ -34,7 +34,7 @@
         <w:t xml:space="preserve"> </w:t>
       </w:r>
       <w:r>
-        <w:t xml:space="preserve">2026, Version 2.2.0.</w:t>
+        <w:t xml:space="preserve">2026, Version 2.3.0.</w:t>
       </w:r>
     </w:p>
     <w:bookmarkStart w:id="9" w:name="was-die-app-tut"/>
@@ -939,7 +939,7 @@
         <w:pStyle w:val="BlockText"/>
       </w:pPr>
       <w:r>
-        <w:t xml:space="preserve">Die Aufnahmen wurden mit LocalTranscript 2.2.0 (B/IAS Basel,</w:t>
+        <w:t xml:space="preserve">Die Aufnahmen wurden mit LocalTranscript 2.3.0 (B/IAS Basel,</w:t>
       </w:r>
       <w:r>
         <w:t xml:space="preserve"> </w:t>

</xml_diff>

<commit_message>
2.4.0 vorbereiten: Version überall, CHANGELOG-Abschnitt, B/IAS-Link auf bias.city/localtranscript (Einstellungen + Über), Datenschutz-Text nennt Video und Zotero, Lizenzliste nennt PyTorch und enrich-core; Website: Video in Schritt 1/3/Import mit Bild, Zotero-Bilder mit englischen Rollen; Blätter: Video-Satz ×4
Co-Authored-By: Claude Fable 5.1 <noreply@anthropic.com>
Claude-Session: https://claude.ai/code/session_01VhoDoDyamQwRzZ3dqypMTk
</commit_message>
<xml_diff>
--- a/site/docs/localtranscript-app-blatt-de.docx
+++ b/site/docs/localtranscript-app-blatt-de.docx
@@ -34,7 +34,7 @@
         <w:t xml:space="preserve"> </w:t>
       </w:r>
       <w:r>
-        <w:t xml:space="preserve">2026, Version 2.3.0.</w:t>
+        <w:t xml:space="preserve">2026, Version 2.4.0.</w:t>
       </w:r>
     </w:p>
     <w:bookmarkStart w:id="9" w:name="was-die-app-tut"/>
@@ -81,7 +81,25 @@
         <w:t xml:space="preserve"> </w:t>
       </w:r>
       <w:r>
-        <w:t xml:space="preserve">CSV, Text). Alles davon geschieht auf dem eigenen Mac.</w:t>
+        <w:t xml:space="preserve">CSV, Text). Videoaufnahmen (MP4/MOV) nimmt sie ebenfalls an: der Ton</w:t>
+      </w:r>
+      <w:r>
+        <w:t xml:space="preserve"> </w:t>
+      </w:r>
+      <w:r>
+        <w:t xml:space="preserve">wird ausgelesen, das Video bleibt unverändert beim Transkript und</w:t>
+      </w:r>
+      <w:r>
+        <w:t xml:space="preserve"> </w:t>
+      </w:r>
+      <w:r>
+        <w:t xml:space="preserve">verlässt den Rechner nur, wenn man es beim REFI-QDA-Export ausdrücklich</w:t>
+      </w:r>
+      <w:r>
+        <w:t xml:space="preserve"> </w:t>
+      </w:r>
+      <w:r>
+        <w:t xml:space="preserve">mitgibt. Alles davon geschieht auf dem eigenen Mac.</w:t>
       </w:r>
     </w:p>
     <w:bookmarkEnd w:id="9"/>
@@ -939,7 +957,7 @@
         <w:pStyle w:val="BlockText"/>
       </w:pPr>
       <w:r>
-        <w:t xml:space="preserve">Die Aufnahmen wurden mit LocalTranscript 2.3.0 (B/IAS Basel,</w:t>
+        <w:t xml:space="preserve">Die Aufnahmen wurden mit LocalTranscript 2.4.0 (B/IAS Basel,</w:t>
       </w:r>
       <w:r>
         <w:t xml:space="preserve"> </w:t>

</xml_diff>

<commit_message>
2.4.1: Version, CHANGELOG (Tabs brechen um, Hochformat-Grenze), Blätter, Lockfiles
Co-Authored-By: Claude Fable 5.1 <noreply@anthropic.com>
Claude-Session: https://claude.ai/code/session_01VhoDoDyamQwRzZ3dqypMTk
</commit_message>
<xml_diff>
--- a/site/docs/localtranscript-app-blatt-de.docx
+++ b/site/docs/localtranscript-app-blatt-de.docx
@@ -34,7 +34,7 @@
         <w:t xml:space="preserve"> </w:t>
       </w:r>
       <w:r>
-        <w:t xml:space="preserve">2026, Version 2.4.0.</w:t>
+        <w:t xml:space="preserve">2026, Version 2.4.1.</w:t>
       </w:r>
     </w:p>
     <w:bookmarkStart w:id="9" w:name="was-die-app-tut"/>
@@ -957,7 +957,7 @@
         <w:pStyle w:val="BlockText"/>
       </w:pPr>
       <w:r>
-        <w:t xml:space="preserve">Die Aufnahmen wurden mit LocalTranscript 2.4.0 (B/IAS Basel,</w:t>
+        <w:t xml:space="preserve">Die Aufnahmen wurden mit LocalTranscript 2.4.1 (B/IAS Basel,</w:t>
       </w:r>
       <w:r>
         <w:t xml:space="preserve"> </w:t>

</xml_diff>

<commit_message>
2.4.2: Lade-Rückmeldung, schnellerer Editor, Zotero-Rollen nach Re-Import; Release-Werkzeug: Notarisierung ausserhalb von tauri build (notarize-app.mjs, build-dmg.mjs, BACKLOG 9 gebaut)
Co-Authored-By: Claude Fable 5.1 <noreply@anthropic.com>
Claude-Session: https://claude.ai/code/session_01VhoDoDyamQwRzZ3dqypMTk
</commit_message>
<xml_diff>
--- a/site/docs/localtranscript-app-blatt-de.docx
+++ b/site/docs/localtranscript-app-blatt-de.docx
@@ -34,7 +34,7 @@
         <w:t xml:space="preserve"> </w:t>
       </w:r>
       <w:r>
-        <w:t xml:space="preserve">2026, Version 2.4.1.</w:t>
+        <w:t xml:space="preserve">2026, Version 2.4.2.</w:t>
       </w:r>
     </w:p>
     <w:bookmarkStart w:id="9" w:name="was-die-app-tut"/>
@@ -957,7 +957,7 @@
         <w:pStyle w:val="BlockText"/>
       </w:pPr>
       <w:r>
-        <w:t xml:space="preserve">Die Aufnahmen wurden mit LocalTranscript 2.4.1 (B/IAS Basel,</w:t>
+        <w:t xml:space="preserve">Die Aufnahmen wurden mit LocalTranscript 2.4.2 (B/IAS Basel,</w:t>
       </w:r>
       <w:r>
         <w:t xml:space="preserve"> </w:t>

</xml_diff>

<commit_message>
2.4.3: whisper.cpp-VAD (Silero v5 als ggml im Paket) gegen Halluzinationen auf Stille, Schleifen-Sicherheitsnetz, Diarisierungs-Guard; Version, CHANGELOG, Blätter, Lockfiles
Co-Authored-By: Claude Fable 5.1 <noreply@anthropic.com>
Claude-Session: https://claude.ai/code/session_01VhoDoDyamQwRzZ3dqypMTk
</commit_message>
<xml_diff>
--- a/site/docs/localtranscript-app-blatt-de.docx
+++ b/site/docs/localtranscript-app-blatt-de.docx
@@ -34,7 +34,7 @@
         <w:t xml:space="preserve"> </w:t>
       </w:r>
       <w:r>
-        <w:t xml:space="preserve">2026, Version 2.4.2.</w:t>
+        <w:t xml:space="preserve">2026, Version 2.4.3.</w:t>
       </w:r>
     </w:p>
     <w:bookmarkStart w:id="9" w:name="was-die-app-tut"/>
@@ -957,7 +957,7 @@
         <w:pStyle w:val="BlockText"/>
       </w:pPr>
       <w:r>
-        <w:t xml:space="preserve">Die Aufnahmen wurden mit LocalTranscript 2.4.2 (B/IAS Basel,</w:t>
+        <w:t xml:space="preserve">Die Aufnahmen wurden mit LocalTranscript 2.4.3 (B/IAS Basel,</w:t>
       </w:r>
       <w:r>
         <w:t xml:space="preserve"> </w:t>

</xml_diff>

<commit_message>
site: Stand 2.5.0 — neue Sprechertrennung, Warteliste, Datum
Version und Datum auf allen Seiten und in den acht Blättern auf 2.5.0
und den 13. September gezogen, die .docx neu gesetzt und eingebettet.
Die Anleitung sagt in allen vier Sprachen, dass abgelegte Dateien erst
in einer Liste warten, jede ihre eigene Sprecherzahl trägt und ohne
diese Angabe kein Lauf startet.

Co-Authored-By: Claude Opus 5 <noreply@anthropic.com>
Claude-Session: https://claude.ai/code/session_01VhoDoDyamQwRzZ3dqypMTk
</commit_message>
<xml_diff>
--- a/site/docs/localtranscript-app-blatt-de.docx
+++ b/site/docs/localtranscript-app-blatt-de.docx
@@ -34,7 +34,7 @@
         <w:t xml:space="preserve"> </w:t>
       </w:r>
       <w:r>
-        <w:t xml:space="preserve">2026, Version 2.4.3.</w:t>
+        <w:t xml:space="preserve">2026, Version 2.5.0.</w:t>
       </w:r>
     </w:p>
     <w:bookmarkStart w:id="9" w:name="was-die-app-tut"/>
@@ -282,7 +282,7 @@
               <w:pStyle w:val="Compact"/>
             </w:pPr>
             <w:r>
-              <w:t xml:space="preserve">SpeechBrain ECAPA-TDNN</w:t>
+              <w:t xml:space="preserve">SpeakerKit (pyannote community-1)</w:t>
             </w:r>
           </w:p>
         </w:tc>
@@ -293,7 +293,7 @@
               <w:pStyle w:val="Compact"/>
             </w:pPr>
             <w:r>
-              <w:t xml:space="preserve">Sprechertrennung: berechnet Stimmprofile und gruppiert sie zu Sprechern</w:t>
+              <w:t xml:space="preserve">Sprechertrennung: erkennt Sprecherwechsel samt Überlappung und gruppiert die Stimmen</w:t>
             </w:r>
           </w:p>
         </w:tc>
@@ -304,7 +304,7 @@
               <w:pStyle w:val="Compact"/>
             </w:pPr>
             <w:r>
-              <w:t xml:space="preserve">Apache-2.0</w:t>
+              <w:t xml:space="preserve">Modell pyannote community-1 (CC-BY-4.0), Laufzeit SpeakerKit von Argmax (MIT)</w:t>
             </w:r>
           </w:p>
         </w:tc>
@@ -315,7 +315,7 @@
               <w:pStyle w:val="Compact"/>
             </w:pPr>
             <w:r>
-              <w:t xml:space="preserve">lokal</w:t>
+              <w:t xml:space="preserve">lokal, auf der Neural Engine des Macs</w:t>
             </w:r>
           </w:p>
         </w:tc>
@@ -957,7 +957,7 @@
         <w:pStyle w:val="BlockText"/>
       </w:pPr>
       <w:r>
-        <w:t xml:space="preserve">Die Aufnahmen wurden mit LocalTranscript 2.4.3 (B/IAS Basel,</w:t>
+        <w:t xml:space="preserve">Die Aufnahmen wurden mit LocalTranscript 2.5.0 (B/IAS Basel,</w:t>
       </w:r>
       <w:r>
         <w:t xml:space="preserve"> </w:t>
@@ -969,7 +969,7 @@
         <w:t xml:space="preserve"> </w:t>
       </w:r>
       <w:r>
-        <w:t xml:space="preserve">Sprechertrennung mit SpeechBrain ECAPA-TDNN) vollständig lokal auf</w:t>
+        <w:t xml:space="preserve">Sprechertrennung mit pyannote community-1-TDNN) vollständig lokal auf</w:t>
       </w:r>
       <w:r>
         <w:t xml:space="preserve"> </w:t>

</xml_diff>

<commit_message>
umzug: Repository liegt jetzt unter bias-city/LocalTranscript
Das Repository ist in die Organisation bias-city übertragen worden, damit
der Namensraum unabhängig vom App-Namen stabil bleibt. Die alte Adresse
unter dem Privatkonto leitet weiter, auch die Release-Downloads.

Website, die acht Blätter und LICENSE-docs zeigen auf den neuen Ort. Die
zwei Verweise im App-Code bleiben bis zur Umbenennung stehen (BACKLOG 13);
die Weiterleitung hält die ausgelieferte App funktionsfähig.

Co-Authored-By: Claude Opus 5 (1M context) <noreply@anthropic.com>
Claude-Session: https://claude.ai/code/session_01VhoDoDyamQwRzZ3dqypMTk
</commit_message>
<xml_diff>
--- a/site/docs/localtranscript-app-blatt-de.docx
+++ b/site/docs/localtranscript-app-blatt-de.docx
@@ -479,7 +479,7 @@
           <w:rPr>
             <w:rStyle w:val="Hyperlink"/>
           </w:rPr>
-          <w:t xml:space="preserve">https://github.com/BenPohlBasel/LocalTranscript</w:t>
+          <w:t xml:space="preserve">https://github.com/bias-city/LocalTranscript</w:t>
         </w:r>
       </w:hyperlink>
     </w:p>
@@ -1012,7 +1012,7 @@
           <w:rPr>
             <w:rStyle w:val="Hyperlink"/>
           </w:rPr>
-          <w:t xml:space="preserve">https://github.com/BenPohlBasel/LocalTranscript</w:t>
+          <w:t xml:space="preserve">https://github.com/bias-city/LocalTranscript</w:t>
         </w:r>
       </w:hyperlink>
       <w:r>

</xml_diff>